<commit_message>
IIM 18 Oct (1/n): invoice id = biller-sadad, classification layer, exclusions only on uncollected invoices, Sanad exclusion rule, «أخرى» outside gross
Co-Authored-By: Claude Sonnet 5.5 <noreply@anthropic.com>
</commit_message>
<xml_diff>
--- a/public/samples/enforcement-orders/EN-6007-attachment.docx
+++ b/public/samples/enforcement-orders/EN-6007-attachment.docx
@@ -109,7 +109,7 @@
           </w:tcPr>
           <w:p>
             <w:r>
-              <w:t xml:space="preserve">INV-2025-0000149</w:t>
+              <w:t xml:space="preserve">177-410230122115</w:t>
             </w:r>
           </w:p>
         </w:tc>
@@ -222,7 +222,7 @@
           </w:tcPr>
           <w:p>
             <w:r>
-              <w:t xml:space="preserve">INV-2025-0000171</w:t>
+              <w:t xml:space="preserve">177-410670121917</w:t>
             </w:r>
           </w:p>
         </w:tc>
@@ -264,7 +264,7 @@
           </w:tcPr>
           <w:p>
             <w:r>
-              <w:t xml:space="preserve">INV-2025-0000220</w:t>
+              <w:t xml:space="preserve">177-411650121476</w:t>
             </w:r>
           </w:p>
         </w:tc>

</xml_diff>